<commit_message>
Update Stella plan with confirmed date of birth
Co-Authored-By: Claude Sonnet 5.5 <noreply@anthropic.com>
Claude-Session: https://claude.ai/code/session_0197vMnGUPBcMxfnHWPgqa1p
</commit_message>
<xml_diff>
--- a/Scholarship_Plan_Stella_Kabengo.docx
+++ b/Scholarship_Plan_Stella_Kabengo.docx
@@ -119,7 +119,7 @@
           <w:sz w:val="21"/>
           <w:szCs w:val="21"/>
         </w:rPr>
-        <w:t xml:space="preserve">Strongest scholarship matches: Chevening, Commonwealth Master's, Leeds online MSc in Disability Studies, Swedish Institute, Australia Awards, Joint Japan/World Bank.</w:t>
+        <w:t xml:space="preserve">Age is not a barrier for the strongest awards: none of the recommended awards has an upper age limit. Strongest scholarship matches: Chevening, Commonwealth Master's, Leeds online MSc in Disability Studies, Swedish Institute, Australia Awards, Joint Japan/World Bank.</w:t>
       </w:r>
     </w:p>
     <w:p>
@@ -152,7 +152,7 @@
           <w:sz w:val="21"/>
           <w:szCs w:val="21"/>
         </w:rPr>
-        <w:t xml:space="preserve">The CV does not state a date of birth, so age-limited awards are flagged as likely ineligible, because a 2012 degree suggests the applicant is over 35. Confirm and correct if wrong.</w:t>
+        <w:t xml:space="preserve">Date of birth: 19 April 1988 (age 38 at the start of the 2027/28 programme). That rules out awards with a 35-year age limit.</w:t>
       </w:r>
     </w:p>
     <w:tbl>
@@ -1180,7 +1180,7 @@
                 <w:sz w:val="20"/>
                 <w:szCs w:val="20"/>
               </w:rPr>
-              <w:t xml:space="preserve">NO (likely)</w:t>
+              <w:t xml:space="preserve">NO</w:t>
             </w:r>
           </w:p>
         </w:tc>
@@ -1210,7 +1210,7 @@
                 <w:sz w:val="20"/>
                 <w:szCs w:val="20"/>
               </w:rPr>
-              <w:t xml:space="preserve">Age limit of 35 at programme start (born on or after 1 Jan 1992 for Edinburgh). Skip unless the birth date qualifies.</w:t>
+              <w:t xml:space="preserve">Age limit of 35 at programme start (born on or after 1 Jan 1992 for Edinburgh). Born 1988, so not eligible. Skip.</w:t>
             </w:r>
           </w:p>
         </w:tc>
@@ -1303,7 +1303,7 @@
                 <w:sz w:val="20"/>
                 <w:szCs w:val="20"/>
               </w:rPr>
-              <w:t xml:space="preserve">2027 window closed 1 Sep 2026, and Rhodes has age limits; check for 2028.</w:t>
+              <w:t xml:space="preserve">2027 window closed 1 Sep 2026, and Rhodes has age limits that are likely to exclude someone born in 1988; check the Zambia criteria before 2028.</w:t>
             </w:r>
           </w:p>
         </w:tc>
@@ -2721,24 +2721,6 @@
           <w:szCs w:val="30"/>
         </w:rPr>
         <w:t xml:space="preserve">7. Questions to confirm</w:t>
-      </w:r>
-    </w:p>
-    <w:p>
-      <w:pPr>
-        <w:pStyle w:val="ListParagraph"/>
-        <w:numPr>
-          <w:ilvl w:val="0"/>
-          <w:numId w:val="2"/>
-        </w:numPr>
-        <w:spacing w:after="50"/>
-      </w:pPr>
-      <w:r>
-        <w:rPr>
-          <w:rFonts w:ascii="Calibri" w:cs="Calibri" w:eastAsia="Calibri" w:hAnsi="Calibri"/>
-          <w:sz w:val="21"/>
-          <w:szCs w:val="21"/>
-        </w:rPr>
-        <w:t xml:space="preserve">Date of birth (decides the Mastercard, Rhodes and similar age limits).</w:t>
       </w:r>
     </w:p>
     <w:p>

</xml_diff>

<commit_message>
Note Imperial disabled-students award does not apply
Co-Authored-By: Claude Sonnet 5.5 <noreply@anthropic.com>
Claude-Session: https://claude.ai/code/session_0197vMnGUPBcMxfnHWPgqa1p
</commit_message>
<xml_diff>
--- a/Scholarship_Plan_Stella_Kabengo.docx
+++ b/Scholarship_Plan_Stella_Kabengo.docx
@@ -1433,6 +1433,100 @@
                 <w:sz w:val="20"/>
                 <w:szCs w:val="20"/>
               </w:rPr>
+              <w:t xml:space="preserve">Imperial Disabled Students Scholarship</w:t>
+            </w:r>
+          </w:p>
+        </w:tc>
+        <w:tc>
+          <w:tcPr>
+            <w:tcW w:type="dxa" w:w="1500"/>
+            <w:tcBorders>
+              <w:top w:val="single" w:color="BFBFBF" w:sz="4"/>
+              <w:left w:val="single" w:color="BFBFBF" w:sz="4"/>
+              <w:bottom w:val="single" w:color="BFBFBF" w:sz="4"/>
+              <w:right w:val="single" w:color="BFBFBF" w:sz="4"/>
+            </w:tcBorders>
+            <w:tcMar>
+              <w:top w:type="dxa" w:w="70"/>
+              <w:left w:type="dxa" w:w="110"/>
+              <w:bottom w:type="dxa" w:w="70"/>
+              <w:right w:type="dxa" w:w="110"/>
+            </w:tcMar>
+          </w:tcPr>
+          <w:p>
+            <w:r>
+              <w:rPr>
+                <w:rFonts w:ascii="Calibri" w:cs="Calibri" w:eastAsia="Calibri" w:hAnsi="Calibri"/>
+                <w:b/>
+                <w:bCs/>
+                <w:color w:val="C00000"/>
+                <w:sz w:val="20"/>
+                <w:szCs w:val="20"/>
+              </w:rPr>
+              <w:t xml:space="preserve">NO</w:t>
+            </w:r>
+          </w:p>
+        </w:tc>
+        <w:tc>
+          <w:tcPr>
+            <w:tcW w:type="dxa" w:w="5546"/>
+            <w:tcBorders>
+              <w:top w:val="single" w:color="BFBFBF" w:sz="4"/>
+              <w:left w:val="single" w:color="BFBFBF" w:sz="4"/>
+              <w:bottom w:val="single" w:color="BFBFBF" w:sz="4"/>
+              <w:right w:val="single" w:color="BFBFBF" w:sz="4"/>
+            </w:tcBorders>
+            <w:tcMar>
+              <w:top w:type="dxa" w:w="70"/>
+              <w:left w:type="dxa" w:w="110"/>
+              <w:bottom w:type="dxa" w:w="70"/>
+              <w:right w:type="dxa" w:w="110"/>
+            </w:tcMar>
+          </w:tcPr>
+          <w:p>
+            <w:r>
+              <w:rPr>
+                <w:rFonts w:ascii="Calibri" w:cs="Calibri" w:eastAsia="Calibri" w:hAnsi="Calibri"/>
+                <w:b w:val="false"/>
+                <w:bCs w:val="false"/>
+                <w:sz w:val="20"/>
+                <w:szCs w:val="20"/>
+              </w:rPr>
+              <w:t xml:space="preserve">For students who have a disability. Stella works with people with disabilities but does not have one, so it does not apply.</w:t>
+            </w:r>
+          </w:p>
+        </w:tc>
+      </w:tr>
+      <w:tr>
+        <w:trPr>
+          <w:cantSplit/>
+        </w:trPr>
+        <w:tc>
+          <w:tcPr>
+            <w:tcW w:type="dxa" w:w="2700"/>
+            <w:tcBorders>
+              <w:top w:val="single" w:color="BFBFBF" w:sz="4"/>
+              <w:left w:val="single" w:color="BFBFBF" w:sz="4"/>
+              <w:bottom w:val="single" w:color="BFBFBF" w:sz="4"/>
+              <w:right w:val="single" w:color="BFBFBF" w:sz="4"/>
+            </w:tcBorders>
+            <w:shd w:fill="F2F2F2" w:color="auto" w:val="clear"/>
+            <w:tcMar>
+              <w:top w:type="dxa" w:w="70"/>
+              <w:left w:type="dxa" w:w="110"/>
+              <w:bottom w:type="dxa" w:w="70"/>
+              <w:right w:type="dxa" w:w="110"/>
+            </w:tcMar>
+          </w:tcPr>
+          <w:p>
+            <w:r>
+              <w:rPr>
+                <w:rFonts w:ascii="Calibri" w:cs="Calibri" w:eastAsia="Calibri" w:hAnsi="Calibri"/>
+                <w:b/>
+                <w:bCs/>
+                <w:sz w:val="20"/>
+                <w:szCs w:val="20"/>
+              </w:rPr>
               <w:t xml:space="preserve">Rotary Peace</w:t>
             </w:r>
           </w:p>
@@ -1446,6 +1540,7 @@
               <w:bottom w:val="single" w:color="BFBFBF" w:sz="4"/>
               <w:right w:val="single" w:color="BFBFBF" w:sz="4"/>
             </w:tcBorders>
+            <w:shd w:fill="F2F2F2" w:color="auto" w:val="clear"/>
             <w:tcMar>
               <w:top w:type="dxa" w:w="70"/>
               <w:left w:type="dxa" w:w="110"/>
@@ -1476,6 +1571,7 @@
               <w:bottom w:val="single" w:color="BFBFBF" w:sz="4"/>
               <w:right w:val="single" w:color="BFBFBF" w:sz="4"/>
             </w:tcBorders>
+            <w:shd w:fill="F2F2F2" w:color="auto" w:val="clear"/>
             <w:tcMar>
               <w:top w:type="dxa" w:w="70"/>
               <w:left w:type="dxa" w:w="110"/>
@@ -2775,24 +2871,6 @@
           <w:szCs w:val="21"/>
         </w:rPr>
         <w:t xml:space="preserve">Whether Stella can leave full-time work for a year (decides on-campus vs online options).</w:t>
-      </w:r>
-    </w:p>
-    <w:p>
-      <w:pPr>
-        <w:pStyle w:val="ListParagraph"/>
-        <w:numPr>
-          <w:ilvl w:val="0"/>
-          <w:numId w:val="2"/>
-        </w:numPr>
-        <w:spacing w:after="50"/>
-      </w:pPr>
-      <w:r>
-        <w:rPr>
-          <w:rFonts w:ascii="Calibri" w:cs="Calibri" w:eastAsia="Calibri" w:hAnsi="Calibri"/>
-          <w:sz w:val="21"/>
-          <w:szCs w:val="21"/>
-        </w:rPr>
-        <w:t xml:space="preserve">Whether Stella has a disability (opens the Imperial disabled-students award).</w:t>
       </w:r>
     </w:p>
     <w:p>

</xml_diff>